<commit_message>
Format RKNP title page with NIS branding
</commit_message>
<xml_diff>
--- a/paper/RKNP_SUBMISSION_FINAL_RU.docx
+++ b/paper/RKNP_SUBMISSION_FINAL_RU.docx
@@ -2,89 +2,216 @@
 <file path=word/document.xml><?xml version="1.0" encoding="utf-8"?>
 <w:document xmlns:wpc="http://schemas.microsoft.com/office/word/2010/wordprocessingCanvas" xmlns:mo="http://schemas.microsoft.com/office/mac/office/2008/main" xmlns:mc="http://schemas.openxmlformats.org/markup-compatibility/2006" xmlns:mv="urn:schemas-microsoft-com:mac:vml" xmlns:o="urn:schemas-microsoft-com:office:office" xmlns:r="http://schemas.openxmlformats.org/officeDocument/2006/relationships" xmlns:m="http://schemas.openxmlformats.org/officeDocument/2006/math" xmlns:v="urn:schemas-microsoft-com:vml" xmlns:wp14="http://schemas.microsoft.com/office/word/2010/wordprocessingDrawing" xmlns:wp="http://schemas.openxmlformats.org/drawingml/2006/wordprocessingDrawing" xmlns:w10="urn:schemas-microsoft-com:office:word" xmlns:w="http://schemas.openxmlformats.org/wordprocessingml/2006/main" xmlns:w14="http://schemas.microsoft.com/office/word/2010/wordml" xmlns:wpg="http://schemas.microsoft.com/office/word/2010/wordprocessingGroup" xmlns:wpi="http://schemas.microsoft.com/office/word/2010/wordprocessingInk" xmlns:wne="http://schemas.microsoft.com/office/word/2006/wordml" xmlns:wps="http://schemas.microsoft.com/office/word/2010/wordprocessingShape" mc:Ignorable="w14 wp14">
   <w:body>
+    <w:tbl>
+      <w:tblPr>
+        <w:tblW w:type="auto" w:w="0"/>
+        <w:jc w:val="left"/>
+        <w:tblLayout w:type="fixed"/>
+        <w:tblLook w:firstColumn="1" w:firstRow="1" w:lastColumn="0" w:lastRow="0" w:noHBand="0" w:noVBand="1" w:val="04A0"/>
+        <w:tblBorders>
+          <w:top w:val="nil"/>
+          <w:left w:val="nil"/>
+          <w:bottom w:val="nil"/>
+          <w:right w:val="nil"/>
+          <w:insideH w:val="nil"/>
+          <w:insideV w:val="nil"/>
+        </w:tblBorders>
+      </w:tblPr>
+      <w:tblGrid>
+        <w:gridCol w:w="4819"/>
+        <w:gridCol w:w="4819"/>
+      </w:tblGrid>
+      <w:tr>
+        <w:tc>
+          <w:tcPr>
+            <w:tcW w:type="dxa" w:w="2268"/>
+            <w:vAlign w:val="center"/>
+          </w:tcPr>
+          <w:p>
+            <w:pPr>
+              <w:spacing w:after="0"/>
+              <w:ind w:firstLine="0"/>
+              <w:jc w:val="center"/>
+            </w:pPr>
+            <w:r>
+              <w:drawing>
+                <wp:inline xmlns:a="http://schemas.openxmlformats.org/drawingml/2006/main" xmlns:pic="http://schemas.openxmlformats.org/drawingml/2006/picture">
+                  <wp:extent cx="1152000" cy="641598"/>
+                  <wp:docPr id="1" name="Picture 1"/>
+                  <wp:cNvGraphicFramePr>
+                    <a:graphicFrameLocks noChangeAspect="1"/>
+                  </wp:cNvGraphicFramePr>
+                  <a:graphic>
+                    <a:graphicData uri="http://schemas.openxmlformats.org/drawingml/2006/picture">
+                      <pic:pic>
+                        <pic:nvPicPr>
+                          <pic:cNvPr id="0" name="nis_logo.png"/>
+                          <pic:cNvPicPr/>
+                        </pic:nvPicPr>
+                        <pic:blipFill>
+                          <a:blip r:embed="rId11"/>
+                          <a:stretch>
+                            <a:fillRect/>
+                          </a:stretch>
+                        </pic:blipFill>
+                        <pic:spPr>
+                          <a:xfrm>
+                            <a:off x="0" y="0"/>
+                            <a:ext cx="1152000" cy="641598"/>
+                          </a:xfrm>
+                          <a:prstGeom prst="rect"/>
+                        </pic:spPr>
+                      </pic:pic>
+                    </a:graphicData>
+                  </a:graphic>
+                </wp:inline>
+              </w:drawing>
+            </w:r>
+          </w:p>
+          <w:p>
+            <w:pPr>
+              <w:spacing w:after="0"/>
+              <w:ind w:firstLine="0"/>
+              <w:jc w:val="center"/>
+            </w:pPr>
+            <w:r>
+              <w:rPr>
+                <w:rFonts w:ascii="Times New Roman" w:hAnsi="Times New Roman" w:eastAsia="Times New Roman"/>
+                <w:b w:val="0"/>
+                <w:i w:val="0"/>
+                <w:color w:val="000000"/>
+                <w:sz w:val="17"/>
+              </w:rPr>
+              <w:t>Nazarbayev</w:t>
+              <w:br/>
+              <w:t>Intellectual</w:t>
+              <w:br/>
+              <w:t>Schools</w:t>
+            </w:r>
+          </w:p>
+        </w:tc>
+        <w:tc>
+          <w:tcPr>
+            <w:tcW w:type="dxa" w:w="7370"/>
+            <w:vAlign w:val="center"/>
+          </w:tcPr>
+          <w:p>
+            <w:pPr>
+              <w:spacing w:line="300" w:lineRule="auto" w:after="0"/>
+              <w:ind w:firstLine="0"/>
+              <w:jc w:val="center"/>
+            </w:pPr>
+            <w:r>
+              <w:rPr>
+                <w:rFonts w:ascii="Times New Roman" w:hAnsi="Times New Roman" w:eastAsia="Times New Roman"/>
+                <w:b/>
+                <w:i w:val="0"/>
+                <w:color w:val="000000"/>
+                <w:sz w:val="24"/>
+              </w:rPr>
+              <w:t>Назарбаев Интеллектуальные Школы</w:t>
+            </w:r>
+            <w:r>
+              <w:br/>
+            </w:r>
+            <w:r>
+              <w:rPr>
+                <w:rFonts w:ascii="Times New Roman" w:hAnsi="Times New Roman" w:eastAsia="Times New Roman"/>
+                <w:b/>
+                <w:i w:val="0"/>
+                <w:color w:val="000000"/>
+                <w:sz w:val="24"/>
+              </w:rPr>
+              <w:t>естественно-математического направления г. Атырау</w:t>
+            </w:r>
+          </w:p>
+        </w:tc>
+      </w:tr>
+    </w:tbl>
     <w:p>
       <w:pPr>
-        <w:spacing w:after="0" w:line="312" w:lineRule="auto"/>
-        <w:ind w:firstLine="0"/>
-        <w:jc w:val="center"/>
-      </w:pPr>
-      <w:r>
-        <w:rPr>
-          <w:rFonts w:ascii="Times New Roman" w:hAnsi="Times New Roman" w:eastAsia="Times New Roman"/>
-          <w:b w:val="0"/>
-          <w:i w:val="0"/>
-          <w:color w:val="000000"/>
-          <w:sz w:val="26"/>
-        </w:rPr>
-        <w:t>Республиканский конкурс научных проектов</w:t>
-      </w:r>
-    </w:p>
-    <w:p>
-      <w:pPr>
-        <w:spacing w:after="0" w:line="312" w:lineRule="auto"/>
-        <w:ind w:firstLine="0"/>
-        <w:jc w:val="center"/>
-      </w:pPr>
-      <w:r>
-        <w:rPr>
-          <w:rFonts w:ascii="Times New Roman" w:hAnsi="Times New Roman" w:eastAsia="Times New Roman"/>
-          <w:b w:val="0"/>
-          <w:i w:val="0"/>
-          <w:color w:val="000000"/>
-          <w:sz w:val="26"/>
-        </w:rPr>
-        <w:t>по общеобразовательным предметам</w:t>
-      </w:r>
-    </w:p>
-    <w:p>
-      <w:pPr>
-        <w:spacing w:after="280"/>
+        <w:spacing w:after="1340"/>
         <w:ind w:firstLine="0"/>
       </w:pPr>
     </w:p>
     <w:p>
       <w:pPr>
-        <w:spacing w:after="0" w:line="312" w:lineRule="auto"/>
+        <w:spacing w:line="312" w:lineRule="auto" w:after="0"/>
         <w:ind w:firstLine="0"/>
         <w:jc w:val="center"/>
       </w:pPr>
       <w:r>
         <w:rPr>
           <w:rFonts w:ascii="Times New Roman" w:hAnsi="Times New Roman" w:eastAsia="Times New Roman"/>
-          <w:b w:val="0"/>
-          <w:i w:val="0"/>
-          <w:color w:val="000000"/>
-          <w:sz w:val="26"/>
-        </w:rPr>
-        <w:t>Назарбаев Интеллектуальная школа</w:t>
+          <w:b/>
+          <w:i w:val="0"/>
+          <w:color w:val="000000"/>
+          <w:sz w:val="30"/>
+        </w:rPr>
+        <w:t>СПЕЦИФИЧНЫЕ ДЛЯ АЛГОРИТМИЧЕСКОГО ПАТТЕРНА</w:t>
       </w:r>
     </w:p>
     <w:p>
       <w:pPr>
-        <w:spacing w:after="0" w:line="312" w:lineRule="auto"/>
+        <w:spacing w:line="312" w:lineRule="auto" w:after="0"/>
         <w:ind w:firstLine="0"/>
         <w:jc w:val="center"/>
       </w:pPr>
       <w:r>
         <w:rPr>
           <w:rFonts w:ascii="Times New Roman" w:hAnsi="Times New Roman" w:eastAsia="Times New Roman"/>
-          <w:b w:val="0"/>
-          <w:i w:val="0"/>
-          <w:color w:val="000000"/>
-          <w:sz w:val="26"/>
-        </w:rPr>
-        <w:t>естественно-математического направления г. Атырау</w:t>
+          <w:b/>
+          <w:i w:val="0"/>
+          <w:color w:val="000000"/>
+          <w:sz w:val="30"/>
+        </w:rPr>
+        <w:t>СТРУКТУРНЫЕ ПОДСКАЗКИ В АВТОМАТИЧЕСКОЙ</w:t>
       </w:r>
     </w:p>
     <w:p>
       <w:pPr>
-        <w:spacing w:after="280"/>
+        <w:spacing w:line="312" w:lineRule="auto" w:after="0"/>
         <w:ind w:firstLine="0"/>
+        <w:jc w:val="center"/>
+      </w:pPr>
+      <w:r>
+        <w:rPr>
+          <w:rFonts w:ascii="Times New Roman" w:hAnsi="Times New Roman" w:eastAsia="Times New Roman"/>
+          <w:b/>
+          <w:i w:val="0"/>
+          <w:color w:val="000000"/>
+          <w:sz w:val="30"/>
+        </w:rPr>
+        <w:t>ЛОКАЛИЗАЦИИ ЛОГИЧЕСКИХ ОШИБОК</w:t>
+      </w:r>
+    </w:p>
+    <w:p>
+      <w:pPr>
+        <w:spacing w:line="312" w:lineRule="auto" w:after="0"/>
+        <w:ind w:firstLine="0"/>
+        <w:jc w:val="center"/>
+      </w:pPr>
+      <w:r>
+        <w:rPr>
+          <w:rFonts w:ascii="Times New Roman" w:hAnsi="Times New Roman" w:eastAsia="Times New Roman"/>
+          <w:b/>
+          <w:i w:val="0"/>
+          <w:color w:val="000000"/>
+          <w:sz w:val="30"/>
+        </w:rPr>
+        <w:t>С ПОМОЩЬЮ БОЛЬШОЙ ЯЗЫКОВОЙ МОДЕЛИ</w:t>
+      </w:r>
+    </w:p>
+    <w:p>
+      <w:pPr>
+        <w:spacing w:line="300" w:lineRule="auto" w:after="160"/>
+        <w:ind w:firstLine="0"/>
+        <w:jc w:val="center"/>
       </w:pPr>
     </w:p>
     <w:p>
       <w:pPr>
-        <w:spacing w:after="0" w:line="312" w:lineRule="auto"/>
+        <w:spacing w:line="300" w:lineRule="auto" w:after="0"/>
         <w:ind w:firstLine="0"/>
         <w:jc w:val="center"/>
       </w:pPr>
@@ -94,14 +221,14 @@
           <w:b w:val="0"/>
           <w:i w:val="0"/>
           <w:color w:val="000000"/>
-          <w:sz w:val="26"/>
-        </w:rPr>
-        <w:t>Направление: [НАПРАВЛЕНИЕ]</w:t>
+          <w:sz w:val="24"/>
+        </w:rPr>
+        <w:t>Предварительно зарегистрированный калибровочный эксперимент</w:t>
       </w:r>
     </w:p>
     <w:p>
       <w:pPr>
-        <w:spacing w:after="0" w:line="312" w:lineRule="auto"/>
+        <w:spacing w:line="300" w:lineRule="auto" w:after="0"/>
         <w:ind w:firstLine="0"/>
         <w:jc w:val="center"/>
       </w:pPr>
@@ -111,147 +238,115 @@
           <w:b w:val="0"/>
           <w:i w:val="0"/>
           <w:color w:val="000000"/>
-          <w:sz w:val="26"/>
-        </w:rPr>
-        <w:t>Секция: [СЕКЦИЯ]</w:t>
+          <w:sz w:val="24"/>
+        </w:rPr>
+        <w:t>на корпусе ConDefects-Python</w:t>
       </w:r>
     </w:p>
     <w:p>
       <w:pPr>
-        <w:spacing w:after="280"/>
+        <w:spacing w:line="300" w:lineRule="auto" w:after="0"/>
         <w:ind w:firstLine="0"/>
+        <w:jc w:val="center"/>
+      </w:pPr>
+      <w:r>
+        <w:rPr>
+          <w:rFonts w:ascii="Times New Roman" w:hAnsi="Times New Roman" w:eastAsia="Times New Roman"/>
+          <w:b w:val="0"/>
+          <w:i w:val="0"/>
+          <w:color w:val="000000"/>
+          <w:sz w:val="24"/>
+        </w:rPr>
+        <w:t>Исследование выполнено в рамках проекта AlgoRythm</w:t>
+      </w:r>
+    </w:p>
+    <w:p>
+      <w:pPr>
+        <w:spacing w:line="300" w:lineRule="auto" w:after="500"/>
+        <w:ind w:firstLine="0"/>
+        <w:jc w:val="center"/>
       </w:pPr>
     </w:p>
     <w:p>
       <w:pPr>
-        <w:spacing w:after="0" w:line="312" w:lineRule="auto"/>
+        <w:spacing w:line="312" w:lineRule="auto" w:after="0"/>
         <w:ind w:firstLine="0"/>
-        <w:jc w:val="center"/>
+        <w:jc w:val="right"/>
       </w:pPr>
       <w:r>
         <w:rPr>
           <w:rFonts w:ascii="Times New Roman" w:hAnsi="Times New Roman" w:eastAsia="Times New Roman"/>
-          <w:b/>
-          <w:i w:val="0"/>
-          <w:color w:val="000000"/>
-          <w:sz w:val="30"/>
-        </w:rPr>
-        <w:t>СПЕЦИФИЧНЫЕ ДЛЯ АЛГОРИТМИЧЕСКОГО ПАТТЕРНА</w:t>
+          <w:b w:val="0"/>
+          <w:i w:val="0"/>
+          <w:color w:val="000000"/>
+          <w:sz w:val="24"/>
+        </w:rPr>
+        <w:t>Авторы:</w:t>
       </w:r>
     </w:p>
     <w:p>
       <w:pPr>
-        <w:spacing w:after="0" w:line="312" w:lineRule="auto"/>
+        <w:spacing w:line="312" w:lineRule="auto" w:after="0"/>
         <w:ind w:firstLine="0"/>
-        <w:jc w:val="center"/>
+        <w:jc w:val="right"/>
       </w:pPr>
       <w:r>
         <w:rPr>
           <w:rFonts w:ascii="Times New Roman" w:hAnsi="Times New Roman" w:eastAsia="Times New Roman"/>
-          <w:b/>
-          <w:i w:val="0"/>
-          <w:color w:val="000000"/>
-          <w:sz w:val="30"/>
-        </w:rPr>
-        <w:t>СТРУКТУРНЫЕ ПОДСКАЗКИ В АВТОМАТИЧЕСКОЙ</w:t>
+          <w:b w:val="0"/>
+          <w:i w:val="0"/>
+          <w:color w:val="000000"/>
+          <w:sz w:val="24"/>
+        </w:rPr>
+        <w:t>Сәдібек Нұрмұхамбет, 11 «А»</w:t>
       </w:r>
     </w:p>
     <w:p>
       <w:pPr>
-        <w:spacing w:after="0" w:line="312" w:lineRule="auto"/>
+        <w:spacing w:line="312" w:lineRule="auto" w:after="0"/>
         <w:ind w:firstLine="0"/>
-        <w:jc w:val="center"/>
+        <w:jc w:val="right"/>
       </w:pPr>
       <w:r>
         <w:rPr>
           <w:rFonts w:ascii="Times New Roman" w:hAnsi="Times New Roman" w:eastAsia="Times New Roman"/>
-          <w:b/>
-          <w:i w:val="0"/>
-          <w:color w:val="000000"/>
-          <w:sz w:val="30"/>
-        </w:rPr>
-        <w:t>ЛОКАЛИЗАЦИИ ЛОГИЧЕСКИХ ОШИБОК</w:t>
+          <w:b w:val="0"/>
+          <w:i w:val="0"/>
+          <w:color w:val="000000"/>
+          <w:sz w:val="24"/>
+        </w:rPr>
+        <w:t>Хасан Амир, 11 «Е»</w:t>
       </w:r>
     </w:p>
     <w:p>
       <w:pPr>
-        <w:spacing w:after="0" w:line="312" w:lineRule="auto"/>
+        <w:spacing w:line="312" w:lineRule="auto" w:after="0"/>
         <w:ind w:firstLine="0"/>
-        <w:jc w:val="center"/>
+        <w:jc w:val="right"/>
       </w:pPr>
       <w:r>
         <w:rPr>
           <w:rFonts w:ascii="Times New Roman" w:hAnsi="Times New Roman" w:eastAsia="Times New Roman"/>
-          <w:b/>
-          <w:i w:val="0"/>
-          <w:color w:val="000000"/>
-          <w:sz w:val="30"/>
-        </w:rPr>
-        <w:t>С ПОМОЩЬЮ БОЛЬШОЙ ЯЗЫКОВОЙ МОДЕЛИ</w:t>
+          <w:b w:val="0"/>
+          <w:i w:val="0"/>
+          <w:color w:val="000000"/>
+          <w:sz w:val="24"/>
+        </w:rPr>
+        <w:t>Научный руководитель: Исказиева А.Ж.</w:t>
       </w:r>
     </w:p>
     <w:p>
       <w:pPr>
-        <w:spacing w:after="0" w:line="300" w:lineRule="auto"/>
+        <w:spacing w:line="300" w:lineRule="auto" w:after="800"/>
         <w:ind w:firstLine="0"/>
         <w:jc w:val="center"/>
-      </w:pPr>
-      <w:r>
-        <w:rPr>
-          <w:rFonts w:ascii="Times New Roman" w:hAnsi="Times New Roman" w:eastAsia="Times New Roman"/>
-          <w:b w:val="0"/>
-          <w:i w:val="0"/>
-          <w:color w:val="000000"/>
-          <w:sz w:val="24"/>
-        </w:rPr>
-        <w:t>Предварительно зарегистрированный калибровочный эксперимент</w:t>
-      </w:r>
-    </w:p>
-    <w:p>
-      <w:pPr>
-        <w:spacing w:after="0" w:line="300" w:lineRule="auto"/>
-        <w:ind w:firstLine="0"/>
-        <w:jc w:val="center"/>
-      </w:pPr>
-      <w:r>
-        <w:rPr>
-          <w:rFonts w:ascii="Times New Roman" w:hAnsi="Times New Roman" w:eastAsia="Times New Roman"/>
-          <w:b w:val="0"/>
-          <w:i w:val="0"/>
-          <w:color w:val="000000"/>
-          <w:sz w:val="24"/>
-        </w:rPr>
-        <w:t>на корпусе ConDefects-Python</w:t>
-      </w:r>
-    </w:p>
-    <w:p>
-      <w:pPr>
-        <w:spacing w:after="0" w:line="300" w:lineRule="auto"/>
-        <w:ind w:firstLine="0"/>
-        <w:jc w:val="center"/>
-      </w:pPr>
-      <w:r>
-        <w:rPr>
-          <w:rFonts w:ascii="Times New Roman" w:hAnsi="Times New Roman" w:eastAsia="Times New Roman"/>
-          <w:b w:val="0"/>
-          <w:i w:val="0"/>
-          <w:color w:val="000000"/>
-          <w:sz w:val="24"/>
-        </w:rPr>
-        <w:t>Исследование выполнено в рамках проекта AlgoRythm</w:t>
-      </w:r>
-    </w:p>
-    <w:p>
-      <w:pPr>
-        <w:spacing w:after="280"/>
-        <w:ind w:firstLine="0"/>
       </w:pPr>
     </w:p>
     <w:p>
       <w:pPr>
-        <w:spacing w:after="0" w:line="312" w:lineRule="auto"/>
+        <w:spacing w:line="300" w:lineRule="auto" w:after="0"/>
         <w:ind w:firstLine="0"/>
-        <w:jc w:val="right"/>
+        <w:jc w:val="center"/>
       </w:pPr>
       <w:r>
         <w:rPr>
@@ -261,14 +356,14 @@
           <w:color w:val="000000"/>
           <w:sz w:val="24"/>
         </w:rPr>
-        <w:t>Автор: [ФИО АВТОРА]</w:t>
+        <w:t>Направление: [НАПРАВЛЕНИЕ]</w:t>
       </w:r>
     </w:p>
     <w:p>
       <w:pPr>
-        <w:spacing w:after="0" w:line="312" w:lineRule="auto"/>
+        <w:spacing w:line="300" w:lineRule="auto" w:after="0"/>
         <w:ind w:firstLine="0"/>
-        <w:jc w:val="right"/>
+        <w:jc w:val="center"/>
       </w:pPr>
       <w:r>
         <w:rPr>
@@ -278,54 +373,21 @@
           <w:color w:val="000000"/>
           <w:sz w:val="24"/>
         </w:rPr>
-        <w:t>Класс: [КЛАСС]</w:t>
+        <w:t>Секция: [СЕКЦИЯ]</w:t>
       </w:r>
     </w:p>
     <w:p>
       <w:pPr>
-        <w:spacing w:after="0" w:line="312" w:lineRule="auto"/>
+        <w:spacing w:line="300" w:lineRule="auto" w:after="240"/>
         <w:ind w:firstLine="0"/>
-        <w:jc w:val="right"/>
-      </w:pPr>
-      <w:r>
-        <w:rPr>
-          <w:rFonts w:ascii="Times New Roman" w:hAnsi="Times New Roman" w:eastAsia="Times New Roman"/>
-          <w:b w:val="0"/>
-          <w:i w:val="0"/>
-          <w:color w:val="000000"/>
-          <w:sz w:val="24"/>
-        </w:rPr>
-        <w:t>Год выпуска: 2028</w:t>
-      </w:r>
-    </w:p>
-    <w:p>
-      <w:pPr>
-        <w:spacing w:after="0" w:line="312" w:lineRule="auto"/>
-        <w:ind w:firstLine="0"/>
-        <w:jc w:val="right"/>
-      </w:pPr>
-      <w:r>
-        <w:rPr>
-          <w:rFonts w:ascii="Times New Roman" w:hAnsi="Times New Roman" w:eastAsia="Times New Roman"/>
-          <w:b w:val="0"/>
-          <w:i w:val="0"/>
-          <w:color w:val="000000"/>
-          <w:sz w:val="24"/>
-        </w:rPr>
-        <w:t>Научный руководитель: [НАУЧНЫЙ РУКОВОДИТЕЛЬ]</w:t>
-      </w:r>
-    </w:p>
-    <w:p>
-      <w:pPr>
-        <w:spacing w:after="280"/>
-        <w:ind w:firstLine="0"/>
+        <w:jc w:val="center"/>
       </w:pPr>
     </w:p>
     <w:p>
       <w:pPr>
-        <w:spacing w:after="0" w:line="312" w:lineRule="auto"/>
+        <w:spacing w:line="300" w:lineRule="auto" w:after="0"/>
         <w:ind w:firstLine="0"/>
-        <w:jc w:val="right"/>
+        <w:jc w:val="center"/>
       </w:pPr>
       <w:r>
         <w:rPr>
@@ -3396,7 +3458,7 @@
         <w:drawing>
           <wp:inline xmlns:a="http://schemas.openxmlformats.org/drawingml/2006/main" xmlns:pic="http://schemas.openxmlformats.org/drawingml/2006/picture">
             <wp:extent cx="5760000" cy="3202768"/>
-            <wp:docPr id="1" name="Picture 1"/>
+            <wp:docPr id="2" name="Picture 2"/>
             <wp:cNvGraphicFramePr>
               <a:graphicFrameLocks noChangeAspect="1"/>
             </wp:cNvGraphicFramePr>
@@ -3408,7 +3470,7 @@
                     <pic:cNvPicPr/>
                   </pic:nvPicPr>
                   <pic:blipFill>
-                    <a:blip r:embed="rId11"/>
+                    <a:blip r:embed="rId12"/>
                     <a:stretch>
                       <a:fillRect/>
                     </a:stretch>
@@ -3689,7 +3751,7 @@
         <w:drawing>
           <wp:inline xmlns:a="http://schemas.openxmlformats.org/drawingml/2006/main" xmlns:pic="http://schemas.openxmlformats.org/drawingml/2006/picture">
             <wp:extent cx="5256000" cy="5589781"/>
-            <wp:docPr id="2" name="Picture 2"/>
+            <wp:docPr id="3" name="Picture 3"/>
             <wp:cNvGraphicFramePr>
               <a:graphicFrameLocks noChangeAspect="1"/>
             </wp:cNvGraphicFramePr>
@@ -3701,7 +3763,7 @@
                     <pic:cNvPicPr/>
                   </pic:nvPicPr>
                   <pic:blipFill>
-                    <a:blip r:embed="rId12"/>
+                    <a:blip r:embed="rId13"/>
                     <a:stretch>
                       <a:fillRect/>
                     </a:stretch>
@@ -5663,7 +5725,7 @@
         <w:drawing>
           <wp:inline xmlns:a="http://schemas.openxmlformats.org/drawingml/2006/main" xmlns:pic="http://schemas.openxmlformats.org/drawingml/2006/picture">
             <wp:extent cx="5903999" cy="3257973"/>
-            <wp:docPr id="3" name="Picture 3"/>
+            <wp:docPr id="4" name="Picture 4"/>
             <wp:cNvGraphicFramePr>
               <a:graphicFrameLocks noChangeAspect="1"/>
             </wp:cNvGraphicFramePr>
@@ -5675,7 +5737,7 @@
                     <pic:cNvPicPr/>
                   </pic:nvPicPr>
                   <pic:blipFill>
-                    <a:blip r:embed="rId13"/>
+                    <a:blip r:embed="rId14"/>
                     <a:stretch>
                       <a:fillRect/>
                     </a:stretch>
@@ -9359,7 +9421,7 @@
         <w:drawing>
           <wp:inline xmlns:a="http://schemas.openxmlformats.org/drawingml/2006/main" xmlns:pic="http://schemas.openxmlformats.org/drawingml/2006/picture">
             <wp:extent cx="5400000" cy="2726550"/>
-            <wp:docPr id="4" name="Picture 4"/>
+            <wp:docPr id="5" name="Picture 5"/>
             <wp:cNvGraphicFramePr>
               <a:graphicFrameLocks noChangeAspect="1"/>
             </wp:cNvGraphicFramePr>
@@ -9371,7 +9433,7 @@
                     <pic:cNvPicPr/>
                   </pic:nvPicPr>
                   <pic:blipFill>
-                    <a:blip r:embed="rId14"/>
+                    <a:blip r:embed="rId15"/>
                     <a:stretch>
                       <a:fillRect/>
                     </a:stretch>
@@ -9418,7 +9480,7 @@
         <w:drawing>
           <wp:inline xmlns:a="http://schemas.openxmlformats.org/drawingml/2006/main" xmlns:pic="http://schemas.openxmlformats.org/drawingml/2006/picture">
             <wp:extent cx="5040000" cy="1864574"/>
-            <wp:docPr id="5" name="Picture 5"/>
+            <wp:docPr id="6" name="Picture 6"/>
             <wp:cNvGraphicFramePr>
               <a:graphicFrameLocks noChangeAspect="1"/>
             </wp:cNvGraphicFramePr>
@@ -9430,7 +9492,7 @@
                     <pic:cNvPicPr/>
                   </pic:nvPicPr>
                   <pic:blipFill>
-                    <a:blip r:embed="rId15"/>
+                    <a:blip r:embed="rId16"/>
                     <a:stretch>
                       <a:fillRect/>
                     </a:stretch>
@@ -10642,7 +10704,7 @@
         <w:drawing>
           <wp:inline xmlns:a="http://schemas.openxmlformats.org/drawingml/2006/main" xmlns:pic="http://schemas.openxmlformats.org/drawingml/2006/picture">
             <wp:extent cx="5472000" cy="2385056"/>
-            <wp:docPr id="6" name="Picture 6"/>
+            <wp:docPr id="7" name="Picture 7"/>
             <wp:cNvGraphicFramePr>
               <a:graphicFrameLocks noChangeAspect="1"/>
             </wp:cNvGraphicFramePr>
@@ -10654,7 +10716,7 @@
                     <pic:cNvPicPr/>
                   </pic:nvPicPr>
                   <pic:blipFill>
-                    <a:blip r:embed="rId16"/>
+                    <a:blip r:embed="rId17"/>
                     <a:stretch>
                       <a:fillRect/>
                     </a:stretch>

</xml_diff>